<commit_message>
correção de inconsistências e bugs em todo o projeto, remoção de código morto, adicionei e.printStackTrace() aos catch principais (de operação) que estavam vazios nos DAOs, removi toda a lógica de peças
</commit_message>
<xml_diff>
--- a/LEI_Progamação_Aplicada_2026_AP3_RelatórioFinal_André-Santiago&Hugo-Nobre_2026-06-19.docx
+++ b/LEI_Progamação_Aplicada_2026_AP3_RelatórioFinal_André-Santiago&Hugo-Nobre_2026-06-19.docx
@@ -973,7 +973,6 @@
           <w:docPartUnique/>
         </w:docPartObj>
       </w:sdtPr>
-      <w:sdtEndPr/>
       <w:sdtContent>
         <w:p>
           <w:pPr>
@@ -2783,6 +2782,9 @@
         </w:sectPr>
       </w:pPr>
     </w:p>
+    <w:bookmarkStart w:id="2" w:name="_Toc467679981"/>
+    <w:bookmarkStart w:id="3" w:name="_Toc467696928"/>
+    <w:bookmarkStart w:id="4" w:name="_Toc227164679"/>
     <w:p>
       <w:pPr>
         <w:pStyle w:val="Ttulo1"/>
@@ -2797,9 +2799,6 @@
           <w:lang w:val="pt-PT"/>
         </w:rPr>
       </w:pPr>
-      <w:bookmarkStart w:id="2" w:name="_Toc467679981"/>
-      <w:bookmarkStart w:id="3" w:name="_Toc467696928"/>
-      <w:bookmarkStart w:id="4" w:name="_Toc227164679"/>
       <w:r>
         <w:rPr>
           <w:rFonts w:cstheme="minorHAnsi"/>
@@ -5478,19 +5477,7 @@
         <w:rPr>
           <w:rFonts w:asciiTheme="minorHAnsi" w:hAnsiTheme="minorHAnsi" w:cstheme="minorHAnsi"/>
         </w:rPr>
-        <w:t xml:space="preserve">Completar e corrigir a aplicação iniciada no projeto anterior, </w:t>
-      </w:r>
-      <w:r>
-        <w:rPr>
-          <w:rFonts w:asciiTheme="minorHAnsi" w:hAnsiTheme="minorHAnsi" w:cstheme="minorHAnsi"/>
-        </w:rPr>
-        <w:t>aplicando-lhe uma</w:t>
-      </w:r>
-      <w:r>
-        <w:rPr>
-          <w:rFonts w:asciiTheme="minorHAnsi" w:hAnsiTheme="minorHAnsi" w:cstheme="minorHAnsi"/>
-        </w:rPr>
-        <w:t xml:space="preserve"> interface gráfica;</w:t>
+        <w:t>Completar e corrigir a aplicação iniciada no projeto anterior, aplicando-lhe uma interface gráfica;</w:t>
       </w:r>
     </w:p>
     <w:p>
@@ -11249,21 +11236,7 @@
               <w:rPr>
                 <w:rFonts w:cstheme="minorHAnsi"/>
               </w:rPr>
-              <w:t xml:space="preserve"> (</w:t>
-            </w:r>
-            <w:proofErr w:type="spellStart"/>
-            <w:r>
-              <w:rPr>
-                <w:rFonts w:cstheme="minorHAnsi"/>
-              </w:rPr>
-              <w:t>PrinterJob</w:t>
-            </w:r>
-            <w:proofErr w:type="spellEnd"/>
-            <w:r>
-              <w:rPr>
-                <w:rFonts w:cstheme="minorHAnsi"/>
-              </w:rPr>
-              <w:t>, Graphics2D).</w:t>
+              <w:t>.</w:t>
             </w:r>
           </w:p>
         </w:tc>
@@ -11288,28 +11261,46 @@
         <w:rPr>
           <w:rFonts w:cstheme="minorHAnsi"/>
         </w:rPr>
-        <w:t xml:space="preserve">Conforme o R12, a manipulação de peças e testes não é disponibilizada graficamente; a respetiva lógica permanece na camada de negócio (controladores e </w:t>
-      </w:r>
-      <w:proofErr w:type="spellStart"/>
-      <w:r>
-        <w:rPr>
-          <w:rFonts w:cstheme="minorHAnsi"/>
-        </w:rPr>
-        <w:t>DAOs</w:t>
-      </w:r>
-      <w:proofErr w:type="spellEnd"/>
-      <w:r>
-        <w:rPr>
-          <w:rFonts w:cstheme="minorHAnsi"/>
-        </w:rPr>
-        <w:t xml:space="preserve">). Conforme o R13, não é disponibilizada a criação de novos gestores através da interface, sendo </w:t>
+        <w:t>Conforme o R12, a manipulação de peças e testes não é disponibilizada graficamente</w:t>
+      </w:r>
+      <w:r>
+        <w:rPr>
+          <w:rFonts w:cstheme="minorHAnsi"/>
+        </w:rPr>
+        <w:t>,</w:t>
+      </w:r>
+      <w:r>
+        <w:rPr>
+          <w:rFonts w:cstheme="minorHAnsi"/>
+        </w:rPr>
+        <w:t xml:space="preserve"> a respetiva </w:t>
+      </w:r>
+      <w:r>
+        <w:rPr>
+          <w:rFonts w:cstheme="minorHAnsi"/>
+          <w:color w:val="EE0000"/>
+        </w:rPr>
+        <w:t xml:space="preserve">lógica </w:t>
+      </w:r>
+      <w:r>
+        <w:rPr>
+          <w:rFonts w:cstheme="minorHAnsi"/>
+          <w:color w:val="EE0000"/>
+        </w:rPr>
+        <w:t>foi apagada do projeto</w:t>
+      </w:r>
+      <w:r>
+        <w:rPr>
+          <w:rFonts w:cstheme="minorHAnsi"/>
+        </w:rPr>
+        <w:t xml:space="preserve">. Conforme o R13, não é disponibilizada a criação </w:t>
       </w:r>
       <w:r>
         <w:rPr>
           <w:rFonts w:cstheme="minorHAnsi"/>
         </w:rPr>
         <w:lastRenderedPageBreak/>
-        <w:t>apenas criado automaticamente o primeiro gestor no arranque, caso não exista nenhum.</w:t>
+        <w:t>de novos gestores através da interface, sendo apenas criado automaticamente o primeiro gestor no arranque, caso não exista nenhum.</w:t>
       </w:r>
     </w:p>
     <w:p>
@@ -11931,7 +11922,6 @@
         <w:t xml:space="preserve">A janela principal mantém um painel de conteúdo único onde os vários painéis são trocados em tempo de execução. A transição é feita removendo o painel anterior, adicionando o novo e invocando os métodos </w:t>
       </w:r>
       <w:proofErr w:type="spellStart"/>
-      <w:proofErr w:type="gramStart"/>
       <w:r>
         <w:rPr>
           <w:rFonts w:cstheme="minorHAnsi"/>
@@ -11943,17 +11933,9 @@
         <w:rPr>
           <w:rFonts w:cstheme="minorHAnsi"/>
         </w:rPr>
-        <w:t>(</w:t>
-      </w:r>
-      <w:proofErr w:type="gramEnd"/>
-      <w:r>
-        <w:rPr>
-          <w:rFonts w:cstheme="minorHAnsi"/>
-        </w:rPr>
-        <w:t xml:space="preserve">) e </w:t>
+        <w:t xml:space="preserve">() e </w:t>
       </w:r>
       <w:proofErr w:type="spellStart"/>
-      <w:proofErr w:type="gramStart"/>
       <w:r>
         <w:rPr>
           <w:rFonts w:cstheme="minorHAnsi"/>
@@ -11965,14 +11947,7 @@
         <w:rPr>
           <w:rFonts w:cstheme="minorHAnsi"/>
         </w:rPr>
-        <w:t>(</w:t>
-      </w:r>
-      <w:proofErr w:type="gramEnd"/>
-      <w:r>
-        <w:rPr>
-          <w:rFonts w:cstheme="minorHAnsi"/>
-        </w:rPr>
-        <w:t>), tal como recomendado para a gestão dinâmica de contentores Swing.</w:t>
+        <w:t>(), tal como recomendado para a gestão dinâmica de contentores Swing.</w:t>
       </w:r>
     </w:p>
     <w:p>
@@ -12574,7 +12549,6 @@
         <w:t> e matrizes (</w:t>
       </w:r>
       <w:proofErr w:type="spellStart"/>
-      <w:proofErr w:type="gramStart"/>
       <w:r>
         <w:rPr>
           <w:rFonts w:ascii="Calibri" w:hAnsi="Calibri" w:cs="Calibri"/>
@@ -12586,14 +12560,7 @@
         <w:rPr>
           <w:rFonts w:ascii="Calibri" w:hAnsi="Calibri" w:cs="Calibri"/>
         </w:rPr>
-        <w:t>[][</w:t>
-      </w:r>
-      <w:proofErr w:type="gramEnd"/>
-      <w:r>
-        <w:rPr>
-          <w:rFonts w:ascii="Calibri" w:hAnsi="Calibri" w:cs="Calibri"/>
-        </w:rPr>
-        <w:t>]) – para alimentar e atualizar as tabelas (</w:t>
+        <w:t>[][]) – para alimentar e atualizar as tabelas (</w:t>
       </w:r>
       <w:proofErr w:type="spellStart"/>
       <w:r>
@@ -13589,6 +13556,7 @@
       <w:r>
         <w:rPr>
           <w:rFonts w:cstheme="minorHAnsi"/>
+          <w:noProof/>
         </w:rPr>
         <w:drawing>
           <wp:inline distT="0" distB="0" distL="0" distR="0" wp14:anchorId="29CF3FB8" wp14:editId="3F384423">
@@ -14198,6 +14166,9 @@
         <w:jc w:val="center"/>
       </w:pPr>
       <w:r>
+        <w:rPr>
+          <w:noProof/>
+        </w:rPr>
         <w:drawing>
           <wp:inline distT="0" distB="0" distL="0" distR="0" wp14:anchorId="687FBFA9" wp14:editId="0F4F37C3">
             <wp:extent cx="2331733" cy="6840550"/>
@@ -15823,7 +15794,6 @@
         <w:docPartUnique/>
       </w:docPartObj>
     </w:sdtPr>
-    <w:sdtEndPr/>
     <w:sdtContent>
       <w:p>
         <w:pPr>
@@ -28959,6 +28929,7 @@
   <w:style w:type="character" w:default="1" w:styleId="Tipodeletrapredefinidodopargrafo">
     <w:name w:val="Default Paragraph Font"/>
     <w:uiPriority w:val="1"/>
+    <w:semiHidden/>
     <w:unhideWhenUsed/>
   </w:style>
   <w:style w:type="table" w:default="1" w:styleId="Tabelanormal">

</xml_diff>

<commit_message>
bd atualizada e relatório também
</commit_message>
<xml_diff>
--- a/LEI_Progamação_Aplicada_2026_AP3_RelatórioFinal_André-Santiago&Hugo-Nobre_2026-06-19.docx
+++ b/LEI_Progamação_Aplicada_2026_AP3_RelatórioFinal_André-Santiago&Hugo-Nobre_2026-06-19.docx
@@ -973,7 +973,6 @@
           <w:docPartUnique/>
         </w:docPartObj>
       </w:sdtPr>
-      <w:sdtEndPr/>
       <w:sdtContent>
         <w:p>
           <w:pPr>
@@ -5964,11 +5963,12 @@
             <w:hideMark/>
           </w:tcPr>
           <w:p>
-            <w:proofErr w:type="spellStart"/>
             <w:r>
               <w:t>Git</w:t>
             </w:r>
-            <w:proofErr w:type="spellEnd"/>
+            <w:r>
+              <w:t>Hub Desktop</w:t>
+            </w:r>
             <w:r>
               <w:fldChar w:fldCharType="begin"/>
             </w:r>
@@ -6989,7 +6989,13 @@
           </w:tcPr>
           <w:p>
             <w:r>
-              <w:t>Validações.java</w:t>
+              <w:t>Valida</w:t>
+            </w:r>
+            <w:r>
+              <w:t>co</w:t>
+            </w:r>
+            <w:r>
+              <w:t>es.java</w:t>
             </w:r>
           </w:p>
         </w:tc>
@@ -11910,8 +11916,8 @@
         <w:tblLook w:val="04A0" w:firstRow="1" w:lastRow="0" w:firstColumn="1" w:lastColumn="0" w:noHBand="0" w:noVBand="1"/>
       </w:tblPr>
       <w:tblGrid>
-        <w:gridCol w:w="2996"/>
-        <w:gridCol w:w="5498"/>
+        <w:gridCol w:w="2650"/>
+        <w:gridCol w:w="5844"/>
       </w:tblGrid>
       <w:tr>
         <w:trPr>
@@ -12207,7 +12213,7 @@
                 <w:b/>
                 <w:bCs/>
               </w:rPr>
-              <w:t>PECA</w:t>
+              <w:t>NOTIFICACAO</w:t>
             </w:r>
           </w:p>
         </w:tc>
@@ -12226,7 +12232,7 @@
               <w:rPr>
                 <w:rFonts w:cstheme="minorHAnsi"/>
               </w:rPr>
-              <w:t>Peças em armazém com controlo de stock</w:t>
+              <w:t>Notificações do sistema — FK para UTILIZADOR (destinatário)</w:t>
             </w:r>
           </w:p>
         </w:tc>
@@ -12249,7 +12255,7 @@
                 <w:b/>
                 <w:bCs/>
               </w:rPr>
-              <w:t>REPARACAO_PECA</w:t>
+              <w:t>LOGS</w:t>
             </w:r>
           </w:p>
         </w:tc>
@@ -12268,7 +12274,19 @@
               <w:rPr>
                 <w:rFonts w:cstheme="minorHAnsi"/>
               </w:rPr>
-              <w:t>Tabela associativa entre reparações e peças (quantidade usada)</w:t>
+              <w:t xml:space="preserve">Registos de auditoria (data, hora, utilizador, </w:t>
+            </w:r>
+            <w:r>
+              <w:rPr>
+                <w:rFonts w:cstheme="minorHAnsi"/>
+              </w:rPr>
+              <w:t>ação</w:t>
+            </w:r>
+            <w:r>
+              <w:rPr>
+                <w:rFonts w:cstheme="minorHAnsi"/>
+              </w:rPr>
+              <w:t>)</w:t>
             </w:r>
           </w:p>
         </w:tc>
@@ -12291,144 +12309,6 @@
                 <w:b/>
                 <w:bCs/>
               </w:rPr>
-              <w:t>TESTE_OPERACIONALIDADE</w:t>
-            </w:r>
-          </w:p>
-        </w:tc>
-        <w:tc>
-          <w:tcPr>
-            <w:tcW w:w="0" w:type="auto"/>
-            <w:hideMark/>
-          </w:tcPr>
-          <w:p>
-            <w:pPr>
-              <w:rPr>
-                <w:rFonts w:cstheme="minorHAnsi"/>
-              </w:rPr>
-            </w:pPr>
-            <w:r>
-              <w:rPr>
-                <w:rFonts w:cstheme="minorHAnsi"/>
-              </w:rPr>
-              <w:t>Testes realizados durante reparações — FK para REPARACAO</w:t>
-            </w:r>
-          </w:p>
-        </w:tc>
-      </w:tr>
-      <w:tr>
-        <w:tc>
-          <w:tcPr>
-            <w:tcW w:w="0" w:type="auto"/>
-            <w:hideMark/>
-          </w:tcPr>
-          <w:p>
-            <w:pPr>
-              <w:rPr>
-                <w:rFonts w:cstheme="minorHAnsi"/>
-              </w:rPr>
-            </w:pPr>
-            <w:r>
-              <w:rPr>
-                <w:rFonts w:cstheme="minorHAnsi"/>
-                <w:b/>
-                <w:bCs/>
-              </w:rPr>
-              <w:t>NOTIFICACAO</w:t>
-            </w:r>
-          </w:p>
-        </w:tc>
-        <w:tc>
-          <w:tcPr>
-            <w:tcW w:w="0" w:type="auto"/>
-            <w:hideMark/>
-          </w:tcPr>
-          <w:p>
-            <w:pPr>
-              <w:rPr>
-                <w:rFonts w:cstheme="minorHAnsi"/>
-              </w:rPr>
-            </w:pPr>
-            <w:r>
-              <w:rPr>
-                <w:rFonts w:cstheme="minorHAnsi"/>
-              </w:rPr>
-              <w:t>Notificações do sistema — FK para UTILIZADOR (destinatário)</w:t>
-            </w:r>
-          </w:p>
-        </w:tc>
-      </w:tr>
-      <w:tr>
-        <w:tc>
-          <w:tcPr>
-            <w:tcW w:w="0" w:type="auto"/>
-            <w:hideMark/>
-          </w:tcPr>
-          <w:p>
-            <w:pPr>
-              <w:rPr>
-                <w:rFonts w:cstheme="minorHAnsi"/>
-              </w:rPr>
-            </w:pPr>
-            <w:r>
-              <w:rPr>
-                <w:rFonts w:cstheme="minorHAnsi"/>
-                <w:b/>
-                <w:bCs/>
-              </w:rPr>
-              <w:t>LOGS</w:t>
-            </w:r>
-          </w:p>
-        </w:tc>
-        <w:tc>
-          <w:tcPr>
-            <w:tcW w:w="0" w:type="auto"/>
-            <w:hideMark/>
-          </w:tcPr>
-          <w:p>
-            <w:pPr>
-              <w:rPr>
-                <w:rFonts w:cstheme="minorHAnsi"/>
-              </w:rPr>
-            </w:pPr>
-            <w:r>
-              <w:rPr>
-                <w:rFonts w:cstheme="minorHAnsi"/>
-              </w:rPr>
-              <w:t xml:space="preserve">Registos de auditoria (data, hora, utilizador, </w:t>
-            </w:r>
-            <w:r>
-              <w:rPr>
-                <w:rFonts w:cstheme="minorHAnsi"/>
-              </w:rPr>
-              <w:t>ação</w:t>
-            </w:r>
-            <w:r>
-              <w:rPr>
-                <w:rFonts w:cstheme="minorHAnsi"/>
-              </w:rPr>
-              <w:t>)</w:t>
-            </w:r>
-          </w:p>
-        </w:tc>
-      </w:tr>
-      <w:tr>
-        <w:tc>
-          <w:tcPr>
-            <w:tcW w:w="0" w:type="auto"/>
-            <w:hideMark/>
-          </w:tcPr>
-          <w:p>
-            <w:pPr>
-              <w:rPr>
-                <w:rFonts w:cstheme="minorHAnsi"/>
-              </w:rPr>
-            </w:pPr>
-            <w:r>
-              <w:rPr>
-                <w:rFonts w:cstheme="minorHAnsi"/>
-                <w:b/>
-                <w:bCs/>
-              </w:rPr>
               <w:t>REPARACAO_REJEITADA</w:t>
             </w:r>
           </w:p>
@@ -12485,13 +12365,6 @@
     </w:p>
     <w:p>
       <w:pPr>
-        <w:rPr>
-          <w:rFonts w:cstheme="minorHAnsi"/>
-        </w:rPr>
-      </w:pPr>
-    </w:p>
-    <w:p>
-      <w:pPr>
         <w:jc w:val="center"/>
         <w:rPr>
           <w:rFonts w:cstheme="minorHAnsi"/>
@@ -12508,6 +12381,7 @@
         <w:rPr>
           <w:noProof/>
         </w:rPr>
+        <w:lastRenderedPageBreak/>
         <mc:AlternateContent>
           <mc:Choice Requires="wps">
             <w:drawing>
@@ -12653,10 +12527,10 @@
           <w:noProof/>
         </w:rPr>
         <w:drawing>
-          <wp:inline distT="0" distB="0" distL="0" distR="0" wp14:anchorId="29CF3FB8" wp14:editId="3F384423">
-            <wp:extent cx="8741026" cy="5081551"/>
-            <wp:effectExtent l="0" t="0" r="3175" b="5080"/>
-            <wp:docPr id="515650621" name="Imagem 1"/>
+          <wp:inline distT="0" distB="0" distL="0" distR="0" wp14:anchorId="2CD6DE47" wp14:editId="12298BC5">
+            <wp:extent cx="8891270" cy="5243830"/>
+            <wp:effectExtent l="0" t="0" r="5080" b="0"/>
+            <wp:docPr id="1325329736" name="Imagem 1"/>
             <wp:cNvGraphicFramePr>
               <a:graphicFrameLocks xmlns:a="http://schemas.openxmlformats.org/drawingml/2006/main" noChangeAspect="1"/>
             </wp:cNvGraphicFramePr>
@@ -12664,7 +12538,7 @@
               <a:graphicData uri="http://schemas.openxmlformats.org/drawingml/2006/picture">
                 <pic:pic xmlns:pic="http://schemas.openxmlformats.org/drawingml/2006/picture">
                   <pic:nvPicPr>
-                    <pic:cNvPr id="515650621" name=""/>
+                    <pic:cNvPr id="1325329736" name=""/>
                     <pic:cNvPicPr/>
                   </pic:nvPicPr>
                   <pic:blipFill>
@@ -12676,7 +12550,7 @@
                   <pic:spPr>
                     <a:xfrm>
                       <a:off x="0" y="0"/>
-                      <a:ext cx="8764334" cy="5095101"/>
+                      <a:ext cx="8891270" cy="5243830"/>
                     </a:xfrm>
                     <a:prstGeom prst="rect">
                       <a:avLst/>
@@ -13260,6 +13134,9 @@
         <w:jc w:val="center"/>
       </w:pPr>
       <w:r>
+        <w:rPr>
+          <w:noProof/>
+        </w:rPr>
         <w:drawing>
           <wp:inline distT="0" distB="0" distL="0" distR="0" wp14:anchorId="405A2282" wp14:editId="5CEAA147">
             <wp:extent cx="2560542" cy="6866215"/>
@@ -13514,30 +13391,6 @@
         <w:rPr>
           <w:rFonts w:cstheme="minorHAnsi"/>
         </w:rPr>
-        <w:t>Testes de autenticação e gestão de contas</w:t>
-      </w:r>
-      <w:r>
-        <w:rPr>
-          <w:rFonts w:cstheme="minorHAnsi"/>
-        </w:rPr>
-        <w:t>.</w:t>
-      </w:r>
-    </w:p>
-    <w:p>
-      <w:pPr>
-        <w:pStyle w:val="PargrafodaLista"/>
-        <w:numPr>
-          <w:ilvl w:val="0"/>
-          <w:numId w:val="6"/>
-        </w:numPr>
-        <w:rPr>
-          <w:rFonts w:cstheme="minorHAnsi"/>
-        </w:rPr>
-      </w:pPr>
-      <w:r>
-        <w:rPr>
-          <w:rFonts w:cstheme="minorHAnsi"/>
-        </w:rPr>
         <w:t>Navegações entre os painéis consoante</w:t>
       </w:r>
       <w:r>
@@ -14476,8 +14329,9 @@
     <w:p>
       <w:pPr>
         <w:pStyle w:val="Bibliografia"/>
-        <w:ind w:left="0" w:firstLine="0"/>
-        <w:jc w:val="left"/>
+        <w:rPr>
+          <w:rFonts w:ascii="Calibri" w:hAnsi="Calibri" w:cs="Calibri"/>
+        </w:rPr>
       </w:pPr>
       <w:r>
         <w:fldChar w:fldCharType="begin"/>
@@ -14489,233 +14343,372 @@
         <w:fldChar w:fldCharType="separate"/>
       </w:r>
       <w:r>
-        <w:fldChar w:fldCharType="begin"/>
-      </w:r>
-      <w:r>
-        <w:instrText xml:space="preserve"> INCLUDETEXT "C:\\Users\\HP\\AppData\\Local\\Temp\\ZOT4E17.tmp" \c MSRTF </w:instrText>
-      </w:r>
-      <w:r>
-        <w:instrText xml:space="preserve"> \* MERGEFORMAT </w:instrText>
-      </w:r>
-      <w:r>
-        <w:fldChar w:fldCharType="separate"/>
-      </w:r>
-      <w:r>
+        <w:rPr>
+          <w:rFonts w:ascii="Calibri" w:hAnsi="Calibri" w:cs="Calibri"/>
+        </w:rPr>
         <w:t>[1]</w:t>
       </w:r>
       <w:r>
+        <w:rPr>
+          <w:rFonts w:ascii="Calibri" w:hAnsi="Calibri" w:cs="Calibri"/>
+        </w:rPr>
         <w:tab/>
       </w:r>
       <w:r>
         <w:rPr>
+          <w:rFonts w:ascii="Calibri" w:hAnsi="Calibri" w:cs="Calibri"/>
           <w:i/>
           <w:iCs/>
         </w:rPr>
         <w:t>Java</w:t>
       </w:r>
       <w:r>
+        <w:rPr>
+          <w:rFonts w:ascii="Calibri" w:hAnsi="Calibri" w:cs="Calibri"/>
+        </w:rPr>
         <w:t>. [Em linha]. Disponível em: https://www.java.com/pt-BR/</w:t>
       </w:r>
     </w:p>
     <w:p>
       <w:pPr>
         <w:pStyle w:val="Bibliografia"/>
-        <w:jc w:val="left"/>
-      </w:pPr>
-      <w:r>
+        <w:rPr>
+          <w:rFonts w:ascii="Calibri" w:hAnsi="Calibri" w:cs="Calibri"/>
+        </w:rPr>
+      </w:pPr>
+      <w:r>
+        <w:rPr>
+          <w:rFonts w:ascii="Calibri" w:hAnsi="Calibri" w:cs="Calibri"/>
+        </w:rPr>
         <w:t>[2]</w:t>
       </w:r>
       <w:r>
+        <w:rPr>
+          <w:rFonts w:ascii="Calibri" w:hAnsi="Calibri" w:cs="Calibri"/>
+        </w:rPr>
         <w:tab/>
       </w:r>
       <w:r>
         <w:rPr>
+          <w:rFonts w:ascii="Calibri" w:hAnsi="Calibri" w:cs="Calibri"/>
           <w:i/>
           <w:iCs/>
         </w:rPr>
         <w:t>Java Swing</w:t>
       </w:r>
       <w:r>
+        <w:rPr>
+          <w:rFonts w:ascii="Calibri" w:hAnsi="Calibri" w:cs="Calibri"/>
+        </w:rPr>
         <w:t>. [Em linha]. Disponível em: https://docs.oracle.com/javase/8/docs/api/javax/swing/package-summary.html</w:t>
       </w:r>
     </w:p>
     <w:p>
       <w:pPr>
         <w:pStyle w:val="Bibliografia"/>
-        <w:jc w:val="left"/>
-      </w:pPr>
-      <w:r>
+        <w:rPr>
+          <w:rFonts w:ascii="Calibri" w:hAnsi="Calibri" w:cs="Calibri"/>
+        </w:rPr>
+      </w:pPr>
+      <w:r>
+        <w:rPr>
+          <w:rFonts w:ascii="Calibri" w:hAnsi="Calibri" w:cs="Calibri"/>
+        </w:rPr>
         <w:t>[3]</w:t>
       </w:r>
       <w:r>
+        <w:rPr>
+          <w:rFonts w:ascii="Calibri" w:hAnsi="Calibri" w:cs="Calibri"/>
+        </w:rPr>
         <w:tab/>
       </w:r>
-      <w:r>
-        <w:rPr>
+      <w:proofErr w:type="spellStart"/>
+      <w:r>
+        <w:rPr>
+          <w:rFonts w:ascii="Calibri" w:hAnsi="Calibri" w:cs="Calibri"/>
           <w:i/>
           <w:iCs/>
         </w:rPr>
         <w:t>MySQL</w:t>
       </w:r>
-      <w:r>
+      <w:proofErr w:type="spellEnd"/>
+      <w:r>
+        <w:rPr>
+          <w:rFonts w:ascii="Calibri" w:hAnsi="Calibri" w:cs="Calibri"/>
+        </w:rPr>
         <w:t>. [Em linha]. Disponível em: https://www.mysql.com/</w:t>
       </w:r>
     </w:p>
     <w:p>
       <w:pPr>
         <w:pStyle w:val="Bibliografia"/>
-        <w:jc w:val="left"/>
-      </w:pPr>
-      <w:r>
+        <w:rPr>
+          <w:rFonts w:ascii="Calibri" w:hAnsi="Calibri" w:cs="Calibri"/>
+        </w:rPr>
+      </w:pPr>
+      <w:r>
+        <w:rPr>
+          <w:rFonts w:ascii="Calibri" w:hAnsi="Calibri" w:cs="Calibri"/>
+        </w:rPr>
         <w:t>[4]</w:t>
       </w:r>
       <w:r>
+        <w:rPr>
+          <w:rFonts w:ascii="Calibri" w:hAnsi="Calibri" w:cs="Calibri"/>
+        </w:rPr>
         <w:tab/>
       </w:r>
       <w:r>
         <w:rPr>
+          <w:rFonts w:ascii="Calibri" w:hAnsi="Calibri" w:cs="Calibri"/>
           <w:i/>
           <w:iCs/>
         </w:rPr>
         <w:t>JDBC</w:t>
       </w:r>
       <w:r>
+        <w:rPr>
+          <w:rFonts w:ascii="Calibri" w:hAnsi="Calibri" w:cs="Calibri"/>
+        </w:rPr>
         <w:t>. [Em linha]. Disponível em: https://docs.oracle.com/javase/tutorial/jdbc/index.html</w:t>
       </w:r>
     </w:p>
     <w:p>
       <w:pPr>
         <w:pStyle w:val="Bibliografia"/>
-        <w:jc w:val="left"/>
-      </w:pPr>
-      <w:r>
+        <w:rPr>
+          <w:rFonts w:ascii="Calibri" w:hAnsi="Calibri" w:cs="Calibri"/>
+        </w:rPr>
+      </w:pPr>
+      <w:r>
+        <w:rPr>
+          <w:rFonts w:ascii="Calibri" w:hAnsi="Calibri" w:cs="Calibri"/>
+        </w:rPr>
         <w:t>[5]</w:t>
       </w:r>
       <w:r>
+        <w:rPr>
+          <w:rFonts w:ascii="Calibri" w:hAnsi="Calibri" w:cs="Calibri"/>
+        </w:rPr>
         <w:tab/>
       </w:r>
-      <w:r>
-        <w:rPr>
+      <w:proofErr w:type="spellStart"/>
+      <w:r>
+        <w:rPr>
+          <w:rFonts w:ascii="Calibri" w:hAnsi="Calibri" w:cs="Calibri"/>
           <w:i/>
           <w:iCs/>
         </w:rPr>
         <w:t>Flatlaf</w:t>
       </w:r>
-      <w:r>
+      <w:proofErr w:type="spellEnd"/>
+      <w:r>
+        <w:rPr>
+          <w:rFonts w:ascii="Calibri" w:hAnsi="Calibri" w:cs="Calibri"/>
+        </w:rPr>
         <w:t>. [Em linha]. Disponível em: https://www.formdev.com/flatlaf/</w:t>
       </w:r>
     </w:p>
     <w:p>
       <w:pPr>
         <w:pStyle w:val="Bibliografia"/>
-        <w:jc w:val="left"/>
-      </w:pPr>
-      <w:r>
+        <w:rPr>
+          <w:rFonts w:ascii="Calibri" w:hAnsi="Calibri" w:cs="Calibri"/>
+        </w:rPr>
+      </w:pPr>
+      <w:r>
+        <w:rPr>
+          <w:rFonts w:ascii="Calibri" w:hAnsi="Calibri" w:cs="Calibri"/>
+        </w:rPr>
         <w:t>[6]</w:t>
       </w:r>
       <w:r>
+        <w:rPr>
+          <w:rFonts w:ascii="Calibri" w:hAnsi="Calibri" w:cs="Calibri"/>
+        </w:rPr>
         <w:tab/>
       </w:r>
       <w:r>
         <w:rPr>
+          <w:rFonts w:ascii="Calibri" w:hAnsi="Calibri" w:cs="Calibri"/>
           <w:i/>
           <w:iCs/>
         </w:rPr>
         <w:t>Java Mail</w:t>
       </w:r>
       <w:r>
+        <w:rPr>
+          <w:rFonts w:ascii="Calibri" w:hAnsi="Calibri" w:cs="Calibri"/>
+        </w:rPr>
         <w:t>.</w:t>
       </w:r>
     </w:p>
     <w:p>
       <w:pPr>
         <w:pStyle w:val="Bibliografia"/>
-        <w:jc w:val="left"/>
-      </w:pPr>
-      <w:r>
+        <w:rPr>
+          <w:rFonts w:ascii="Calibri" w:hAnsi="Calibri" w:cs="Calibri"/>
+        </w:rPr>
+      </w:pPr>
+      <w:r>
+        <w:rPr>
+          <w:rFonts w:ascii="Calibri" w:hAnsi="Calibri" w:cs="Calibri"/>
+        </w:rPr>
         <w:t>[7]</w:t>
       </w:r>
       <w:r>
+        <w:rPr>
+          <w:rFonts w:ascii="Calibri" w:hAnsi="Calibri" w:cs="Calibri"/>
+        </w:rPr>
         <w:tab/>
       </w:r>
-      <w:r>
-        <w:rPr>
+      <w:proofErr w:type="spellStart"/>
+      <w:r>
+        <w:rPr>
+          <w:rFonts w:ascii="Calibri" w:hAnsi="Calibri" w:cs="Calibri"/>
           <w:i/>
           <w:iCs/>
         </w:rPr>
         <w:t>PowerDesigner</w:t>
       </w:r>
-      <w:r>
+      <w:proofErr w:type="spellEnd"/>
+      <w:r>
+        <w:rPr>
+          <w:rFonts w:ascii="Calibri" w:hAnsi="Calibri" w:cs="Calibri"/>
+        </w:rPr>
         <w:t>. [Em linha]. Disponível em: https://www.powerdesigner.biz/</w:t>
       </w:r>
     </w:p>
     <w:p>
       <w:pPr>
         <w:pStyle w:val="Bibliografia"/>
-        <w:jc w:val="left"/>
-      </w:pPr>
-      <w:r>
+        <w:rPr>
+          <w:rFonts w:ascii="Calibri" w:hAnsi="Calibri" w:cs="Calibri"/>
+        </w:rPr>
+      </w:pPr>
+      <w:r>
+        <w:rPr>
+          <w:rFonts w:ascii="Calibri" w:hAnsi="Calibri" w:cs="Calibri"/>
+        </w:rPr>
         <w:t>[8]</w:t>
       </w:r>
       <w:r>
+        <w:rPr>
+          <w:rFonts w:ascii="Calibri" w:hAnsi="Calibri" w:cs="Calibri"/>
+        </w:rPr>
         <w:tab/>
       </w:r>
-      <w:r>
-        <w:rPr>
+      <w:proofErr w:type="spellStart"/>
+      <w:r>
+        <w:rPr>
+          <w:rFonts w:ascii="Calibri" w:hAnsi="Calibri" w:cs="Calibri"/>
           <w:i/>
           <w:iCs/>
         </w:rPr>
         <w:t>HeidiSQL</w:t>
       </w:r>
-      <w:r>
+      <w:proofErr w:type="spellEnd"/>
+      <w:r>
+        <w:rPr>
+          <w:rFonts w:ascii="Calibri" w:hAnsi="Calibri" w:cs="Calibri"/>
+        </w:rPr>
         <w:t>. [Em linha]. Disponível em: https://www.heidisql.com/download.php</w:t>
       </w:r>
     </w:p>
     <w:p>
       <w:pPr>
         <w:pStyle w:val="Bibliografia"/>
-        <w:jc w:val="left"/>
-      </w:pPr>
-      <w:r>
+        <w:rPr>
+          <w:rFonts w:ascii="Calibri" w:hAnsi="Calibri" w:cs="Calibri"/>
+        </w:rPr>
+      </w:pPr>
+      <w:r>
+        <w:rPr>
+          <w:rFonts w:ascii="Calibri" w:hAnsi="Calibri" w:cs="Calibri"/>
+        </w:rPr>
         <w:t>[9]</w:t>
       </w:r>
       <w:r>
+        <w:rPr>
+          <w:rFonts w:ascii="Calibri" w:hAnsi="Calibri" w:cs="Calibri"/>
+        </w:rPr>
         <w:tab/>
       </w:r>
       <w:r>
         <w:rPr>
+          <w:rFonts w:ascii="Calibri" w:hAnsi="Calibri" w:cs="Calibri"/>
           <w:i/>
           <w:iCs/>
         </w:rPr>
-        <w:t>Visual Studio Code</w:t>
-      </w:r>
-      <w:r>
+        <w:t xml:space="preserve">Visual </w:t>
+      </w:r>
+      <w:proofErr w:type="spellStart"/>
+      <w:r>
+        <w:rPr>
+          <w:rFonts w:ascii="Calibri" w:hAnsi="Calibri" w:cs="Calibri"/>
+          <w:i/>
+          <w:iCs/>
+        </w:rPr>
+        <w:t>Studio</w:t>
+      </w:r>
+      <w:proofErr w:type="spellEnd"/>
+      <w:r>
+        <w:rPr>
+          <w:rFonts w:ascii="Calibri" w:hAnsi="Calibri" w:cs="Calibri"/>
+          <w:i/>
+          <w:iCs/>
+        </w:rPr>
+        <w:t xml:space="preserve"> </w:t>
+      </w:r>
+      <w:proofErr w:type="spellStart"/>
+      <w:r>
+        <w:rPr>
+          <w:rFonts w:ascii="Calibri" w:hAnsi="Calibri" w:cs="Calibri"/>
+          <w:i/>
+          <w:iCs/>
+        </w:rPr>
+        <w:t>Code</w:t>
+      </w:r>
+      <w:proofErr w:type="spellEnd"/>
+      <w:r>
+        <w:rPr>
+          <w:rFonts w:ascii="Calibri" w:hAnsi="Calibri" w:cs="Calibri"/>
+        </w:rPr>
         <w:t>. [Em linha]. Disponível em: https://code.visualstudio.com/download</w:t>
       </w:r>
     </w:p>
     <w:p>
       <w:pPr>
         <w:pStyle w:val="Bibliografia"/>
-        <w:jc w:val="left"/>
-      </w:pPr>
-      <w:r>
+        <w:rPr>
+          <w:rFonts w:ascii="Calibri" w:hAnsi="Calibri" w:cs="Calibri"/>
+        </w:rPr>
+      </w:pPr>
+      <w:r>
+        <w:rPr>
+          <w:rFonts w:ascii="Calibri" w:hAnsi="Calibri" w:cs="Calibri"/>
+        </w:rPr>
         <w:t>[10]</w:t>
       </w:r>
       <w:r>
+        <w:rPr>
+          <w:rFonts w:ascii="Calibri" w:hAnsi="Calibri" w:cs="Calibri"/>
+        </w:rPr>
         <w:tab/>
       </w:r>
       <w:r>
         <w:rPr>
+          <w:rFonts w:ascii="Calibri" w:hAnsi="Calibri" w:cs="Calibri"/>
           <w:i/>
           <w:iCs/>
         </w:rPr>
         <w:t>GitHub Desktop</w:t>
       </w:r>
       <w:r>
+        <w:rPr>
+          <w:rFonts w:ascii="Calibri" w:hAnsi="Calibri" w:cs="Calibri"/>
+        </w:rPr>
         <w:t>. [Em linha]. Disponível em: https://desktop.github.com/download/</w:t>
-      </w:r>
-      <w:r>
-        <w:br/>
       </w:r>
     </w:p>
     <w:p>
@@ -14742,6 +14735,7 @@
         <w:t xml:space="preserve"> e adaptamos ao nosso caso. </w:t>
       </w:r>
     </w:p>
+    <w:p/>
     <w:p>
       <w:pPr>
         <w:pStyle w:val="Bibliografia"/>
@@ -14754,9 +14748,6 @@
           <w:docGrid w:linePitch="360"/>
         </w:sectPr>
       </w:pPr>
-      <w:r>
-        <w:fldChar w:fldCharType="end"/>
-      </w:r>
       <w:r>
         <w:fldChar w:fldCharType="end"/>
       </w:r>
@@ -14912,7 +14903,6 @@
         <w:docPartUnique/>
       </w:docPartObj>
     </w:sdtPr>
-    <w:sdtEndPr/>
     <w:sdtContent>
       <w:p>
         <w:pPr>

</xml_diff>